<commit_message>
multi features ranking + bayesian model
</commit_message>
<xml_diff>
--- a/01_Manuscript/draft/supplementary.docx
+++ b/01_Manuscript/draft/supplementary.docx
@@ -2,6 +2,15 @@
 <file path=word/document.xml><?xml version="1.0" encoding="utf-8"?>
 <w:document xmlns:wpc="http://schemas.microsoft.com/office/word/2010/wordprocessingCanvas" xmlns:cx="http://schemas.microsoft.com/office/drawing/2014/chartex" xmlns:cx1="http://schemas.microsoft.com/office/drawing/2015/9/8/chartex" xmlns:cx2="http://schemas.microsoft.com/office/drawing/2015/10/21/chartex" xmlns:cx3="http://schemas.microsoft.com/office/drawing/2016/5/9/chartex" xmlns:cx4="http://schemas.microsoft.com/office/drawing/2016/5/10/chartex" xmlns:cx5="http://schemas.microsoft.com/office/drawing/2016/5/11/chartex" xmlns:cx6="http://schemas.microsoft.com/office/drawing/2016/5/12/chartex" xmlns:cx7="http://schemas.microsoft.com/office/drawing/2016/5/13/chartex" xmlns:cx8="http://schemas.microsoft.com/office/drawing/2016/5/14/chartex" xmlns:mc="http://schemas.openxmlformats.org/markup-compatibility/2006" xmlns:aink="http://schemas.microsoft.com/office/drawing/2016/ink" xmlns:am3d="http://schemas.microsoft.com/office/drawing/2017/model3d" xmlns:o="urn:schemas-microsoft-com:office:office" xmlns:oel="http://schemas.microsoft.com/office/2019/extlst" xmlns:r="http://schemas.openxmlformats.org/officeDocument/2006/relationships" xmlns:m="http://schemas.openxmlformats.org/officeDocument/2006/math" xmlns:v="urn:schemas-microsoft-com:vml" xmlns:wp14="http://schemas.microsoft.com/office/word/2010/wordprocessingDrawing" xmlns:wp="http://schemas.openxmlformats.org/drawingml/2006/wordprocessingDrawing" xmlns:w10="urn:schemas-microsoft-com:office:word" xmlns:w="http://schemas.openxmlformats.org/wordprocessingml/2006/main" xmlns:w14="http://schemas.microsoft.com/office/word/2010/wordml" xmlns:w15="http://schemas.microsoft.com/office/word/2012/wordml" xmlns:w16cex="http://schemas.microsoft.com/office/word/2018/wordml/cex" xmlns:w16cid="http://schemas.microsoft.com/office/word/2016/wordml/cid" xmlns:w16="http://schemas.microsoft.com/office/word/2018/wordml" xmlns:w16du="http://schemas.microsoft.com/office/word/2023/wordml/word16du" xmlns:w16sdtdh="http://schemas.microsoft.com/office/word/2020/wordml/sdtdatahash" xmlns:w16sdtfl="http://schemas.microsoft.com/office/word/2024/wordml/sdtformatlock" xmlns:w16se="http://schemas.microsoft.com/office/word/2015/wordml/symex" xmlns:wpg="http://schemas.microsoft.com/office/word/2010/wordprocessingGroup" xmlns:wpi="http://schemas.microsoft.com/office/word/2010/wordprocessingInk" xmlns:wne="http://schemas.microsoft.com/office/word/2006/wordml" xmlns:wps="http://schemas.microsoft.com/office/word/2010/wordprocessingShape" mc:Ignorable="w14 w15 w16se w16cid w16 w16cex w16sdtdh w16sdtfl w16du wp14">
   <w:body>
+    <w:p>
+      <w:pPr>
+        <w:pStyle w:val="berschrift1"/>
+      </w:pPr>
+      <w:r>
+        <w:t xml:space="preserve">Materials </w:t>
+      </w:r>
+    </w:p>
+    <w:p/>
     <w:p>
       <w:r>
         <w:t>Data sources and datasets</w:t>
@@ -819,6 +828,7 @@
             </w:pPr>
             <w:proofErr w:type="spellStart"/>
             <w:r>
+              <w:lastRenderedPageBreak/>
               <w:t>tabix</w:t>
             </w:r>
             <w:proofErr w:type="spellEnd"/>
@@ -947,7 +957,6 @@
             </w:pPr>
             <w:proofErr w:type="spellStart"/>
             <w:r>
-              <w:lastRenderedPageBreak/>
               <w:t>NetMHCpan</w:t>
             </w:r>
             <w:proofErr w:type="spellEnd"/>
@@ -1733,6 +1742,7 @@
             </w:pPr>
             <w:proofErr w:type="spellStart"/>
             <w:r>
+              <w:lastRenderedPageBreak/>
               <w:t>Numpy</w:t>
             </w:r>
             <w:proofErr w:type="spellEnd"/>
@@ -1887,7 +1897,6 @@
             </w:pPr>
             <w:proofErr w:type="spellStart"/>
             <w:r>
-              <w:lastRenderedPageBreak/>
               <w:t>CrossDome</w:t>
             </w:r>
             <w:proofErr w:type="spellEnd"/>
@@ -2167,21 +2176,7 @@
                 <w:rPr>
                   <w:rStyle w:val="Hyperlink"/>
                 </w:rPr>
-                <w:t xml:space="preserve">, S.O., Kanitz, A., Wilm, A., Holtgrewe, M., </w:t>
-              </w:r>
-              <w:proofErr w:type="spellStart"/>
-              <w:r>
-                <w:rPr>
-                  <w:rStyle w:val="Hyperlink"/>
-                </w:rPr>
-                <w:t>Rahmann</w:t>
-              </w:r>
-              <w:proofErr w:type="spellEnd"/>
-              <w:r>
-                <w:rPr>
-                  <w:rStyle w:val="Hyperlink"/>
-                </w:rPr>
-                <w:t xml:space="preserve">, S., </w:t>
+                <w:t xml:space="preserve">, S.O., Kanitz, A., Wilm, A., Holtgrewe, M., Rahmann, S., </w:t>
               </w:r>
               <w:proofErr w:type="spellStart"/>
               <w:r>
@@ -2223,6 +2218,306 @@
     </w:p>
     <w:p/>
     <w:p/>
+    <w:p>
+      <w:r>
+        <w:br w:type="page"/>
+      </w:r>
+    </w:p>
+    <w:p>
+      <w:pPr>
+        <w:pStyle w:val="berschrift1"/>
+      </w:pPr>
+      <w:r>
+        <w:lastRenderedPageBreak/>
+        <w:t xml:space="preserve">Methods </w:t>
+      </w:r>
+    </w:p>
+    <w:p>
+      <w:proofErr w:type="spellStart"/>
+      <w:r>
+        <w:t>Dasfdas</w:t>
+      </w:r>
+      <w:proofErr w:type="spellEnd"/>
+    </w:p>
+    <w:p/>
+    <w:p/>
+    <w:p/>
+    <w:p/>
+    <w:p>
+      <w:r>
+        <w:br w:type="page"/>
+      </w:r>
+    </w:p>
+    <w:p>
+      <w:pPr>
+        <w:pStyle w:val="berschrift1"/>
+      </w:pPr>
+      <w:r>
+        <w:lastRenderedPageBreak/>
+        <w:t>Results</w:t>
+      </w:r>
+    </w:p>
+    <w:p/>
+    <w:p>
+      <w:r>
+        <w:t>Target binding motif</w:t>
+      </w:r>
+    </w:p>
+    <w:p/>
+    <w:p>
+      <w:r>
+        <w:drawing>
+          <wp:inline distT="0" distB="0" distL="0" distR="0" wp14:anchorId="1DA3D1F4" wp14:editId="1EC3A082">
+            <wp:extent cx="5760720" cy="2983230"/>
+            <wp:effectExtent l="0" t="0" r="0" b="0"/>
+            <wp:docPr id="1178483540" name="Grafik 1"/>
+            <wp:cNvGraphicFramePr>
+              <a:graphicFrameLocks xmlns:a="http://schemas.openxmlformats.org/drawingml/2006/main" noChangeAspect="1"/>
+            </wp:cNvGraphicFramePr>
+            <a:graphic xmlns:a="http://schemas.openxmlformats.org/drawingml/2006/main">
+              <a:graphicData uri="http://schemas.openxmlformats.org/drawingml/2006/picture">
+                <pic:pic xmlns:pic="http://schemas.openxmlformats.org/drawingml/2006/picture">
+                  <pic:nvPicPr>
+                    <pic:cNvPr id="1178483540" name=""/>
+                    <pic:cNvPicPr/>
+                  </pic:nvPicPr>
+                  <pic:blipFill>
+                    <a:blip r:embed="rId5"/>
+                    <a:stretch>
+                      <a:fillRect/>
+                    </a:stretch>
+                  </pic:blipFill>
+                  <pic:spPr>
+                    <a:xfrm>
+                      <a:off x="0" y="0"/>
+                      <a:ext cx="5760720" cy="2983230"/>
+                    </a:xfrm>
+                    <a:prstGeom prst="rect">
+                      <a:avLst/>
+                    </a:prstGeom>
+                  </pic:spPr>
+                </pic:pic>
+              </a:graphicData>
+            </a:graphic>
+          </wp:inline>
+        </w:drawing>
+      </w:r>
+    </w:p>
+    <w:p/>
+    <w:p/>
+    <w:p>
+      <w:r>
+        <w:t>Bi-features vs multi-features assessment</w:t>
+      </w:r>
+    </w:p>
+    <w:p/>
+    <w:p/>
+    <w:p/>
+    <w:p>
+      <w:r>
+        <w:drawing>
+          <wp:inline distT="0" distB="0" distL="0" distR="0" wp14:anchorId="1145DCC1" wp14:editId="7DD5DD79">
+            <wp:extent cx="5760720" cy="3241675"/>
+            <wp:effectExtent l="0" t="0" r="5080" b="0"/>
+            <wp:docPr id="330503313" name="Grafik 1"/>
+            <wp:cNvGraphicFramePr>
+              <a:graphicFrameLocks xmlns:a="http://schemas.openxmlformats.org/drawingml/2006/main" noChangeAspect="1"/>
+            </wp:cNvGraphicFramePr>
+            <a:graphic xmlns:a="http://schemas.openxmlformats.org/drawingml/2006/main">
+              <a:graphicData uri="http://schemas.openxmlformats.org/drawingml/2006/picture">
+                <pic:pic xmlns:pic="http://schemas.openxmlformats.org/drawingml/2006/picture">
+                  <pic:nvPicPr>
+                    <pic:cNvPr id="330503313" name=""/>
+                    <pic:cNvPicPr/>
+                  </pic:nvPicPr>
+                  <pic:blipFill>
+                    <a:blip r:embed="rId6"/>
+                    <a:stretch>
+                      <a:fillRect/>
+                    </a:stretch>
+                  </pic:blipFill>
+                  <pic:spPr>
+                    <a:xfrm>
+                      <a:off x="0" y="0"/>
+                      <a:ext cx="5760720" cy="3241675"/>
+                    </a:xfrm>
+                    <a:prstGeom prst="rect">
+                      <a:avLst/>
+                    </a:prstGeom>
+                  </pic:spPr>
+                </pic:pic>
+              </a:graphicData>
+            </a:graphic>
+          </wp:inline>
+        </w:drawing>
+      </w:r>
+    </w:p>
+    <w:p/>
+    <w:p/>
+    <w:p/>
+    <w:p/>
+    <w:p>
+      <w:r>
+        <w:lastRenderedPageBreak/>
+        <w:t xml:space="preserve">Bi-features score validation </w:t>
+      </w:r>
+    </w:p>
+    <w:p/>
+    <w:p/>
+    <w:p>
+      <w:r>
+        <w:rPr>
+          <w:noProof/>
+        </w:rPr>
+        <w:drawing>
+          <wp:inline distT="0" distB="0" distL="0" distR="0" wp14:anchorId="7EAB4290" wp14:editId="5C1DC98E">
+            <wp:extent cx="5760720" cy="2753995"/>
+            <wp:effectExtent l="0" t="0" r="5080" b="1905"/>
+            <wp:docPr id="370528450" name="Grafik 4" descr="Ein Bild, das Text, Reihe, Diagramm, Schrift enthält.&#10;&#10;KI-generierte Inhalte können fehlerhaft sein."/>
+            <wp:cNvGraphicFramePr>
+              <a:graphicFrameLocks xmlns:a="http://schemas.openxmlformats.org/drawingml/2006/main" noChangeAspect="1"/>
+            </wp:cNvGraphicFramePr>
+            <a:graphic xmlns:a="http://schemas.openxmlformats.org/drawingml/2006/main">
+              <a:graphicData uri="http://schemas.openxmlformats.org/drawingml/2006/picture">
+                <pic:pic xmlns:pic="http://schemas.openxmlformats.org/drawingml/2006/picture">
+                  <pic:nvPicPr>
+                    <pic:cNvPr id="370528450" name="Grafik 4" descr="Ein Bild, das Text, Reihe, Diagramm, Schrift enthält.&#10;&#10;KI-generierte Inhalte können fehlerhaft sein."/>
+                    <pic:cNvPicPr/>
+                  </pic:nvPicPr>
+                  <pic:blipFill>
+                    <a:blip r:embed="rId7" cstate="print">
+                      <a:extLst>
+                        <a:ext uri="{28A0092B-C50C-407E-A947-70E740481C1C}">
+                          <a14:useLocalDpi xmlns:a14="http://schemas.microsoft.com/office/drawing/2010/main" val="0"/>
+                        </a:ext>
+                      </a:extLst>
+                    </a:blip>
+                    <a:stretch>
+                      <a:fillRect/>
+                    </a:stretch>
+                  </pic:blipFill>
+                  <pic:spPr>
+                    <a:xfrm>
+                      <a:off x="0" y="0"/>
+                      <a:ext cx="5760720" cy="2753995"/>
+                    </a:xfrm>
+                    <a:prstGeom prst="rect">
+                      <a:avLst/>
+                    </a:prstGeom>
+                  </pic:spPr>
+                </pic:pic>
+              </a:graphicData>
+            </a:graphic>
+          </wp:inline>
+        </w:drawing>
+      </w:r>
+    </w:p>
+    <w:p>
+      <w:r>
+        <w:rPr>
+          <w:noProof/>
+        </w:rPr>
+        <w:drawing>
+          <wp:inline distT="0" distB="0" distL="0" distR="0" wp14:anchorId="43E9BF45" wp14:editId="795B9A6C">
+            <wp:extent cx="5069941" cy="4004203"/>
+            <wp:effectExtent l="0" t="0" r="0" b="0"/>
+            <wp:docPr id="4" name="Grafik 3" descr="Ein Bild, das Text, Diagramm, Reihe, Screenshot enthält.&#10;&#10;KI-generierte Inhalte können fehlerhaft sein.">
+              <a:extLst xmlns:a="http://schemas.openxmlformats.org/drawingml/2006/main">
+                <a:ext uri="{FF2B5EF4-FFF2-40B4-BE49-F238E27FC236}">
+                  <a16:creationId xmlns:a16="http://schemas.microsoft.com/office/drawing/2014/main" id="{F59EA04B-A995-16E5-B528-C0CB34B6169E}"/>
+                </a:ext>
+              </a:extLst>
+            </wp:docPr>
+            <wp:cNvGraphicFramePr>
+              <a:graphicFrameLocks xmlns:a="http://schemas.openxmlformats.org/drawingml/2006/main" noChangeAspect="1"/>
+            </wp:cNvGraphicFramePr>
+            <a:graphic xmlns:a="http://schemas.openxmlformats.org/drawingml/2006/main">
+              <a:graphicData uri="http://schemas.openxmlformats.org/drawingml/2006/picture">
+                <pic:pic xmlns:pic="http://schemas.openxmlformats.org/drawingml/2006/picture">
+                  <pic:nvPicPr>
+                    <pic:cNvPr id="4" name="Grafik 3" descr="Ein Bild, das Text, Diagramm, Reihe, Screenshot enthält.&#10;&#10;KI-generierte Inhalte können fehlerhaft sein.">
+                      <a:extLst>
+                        <a:ext uri="{FF2B5EF4-FFF2-40B4-BE49-F238E27FC236}">
+                          <a16:creationId xmlns:a16="http://schemas.microsoft.com/office/drawing/2014/main" id="{F59EA04B-A995-16E5-B528-C0CB34B6169E}"/>
+                        </a:ext>
+                      </a:extLst>
+                    </pic:cNvPr>
+                    <pic:cNvPicPr>
+                      <a:picLocks noChangeAspect="1"/>
+                    </pic:cNvPicPr>
+                  </pic:nvPicPr>
+                  <pic:blipFill>
+                    <a:blip r:embed="rId8"/>
+                    <a:stretch>
+                      <a:fillRect/>
+                    </a:stretch>
+                  </pic:blipFill>
+                  <pic:spPr>
+                    <a:xfrm>
+                      <a:off x="0" y="0"/>
+                      <a:ext cx="5106473" cy="4033056"/>
+                    </a:xfrm>
+                    <a:prstGeom prst="rect">
+                      <a:avLst/>
+                    </a:prstGeom>
+                  </pic:spPr>
+                </pic:pic>
+              </a:graphicData>
+            </a:graphic>
+          </wp:inline>
+        </w:drawing>
+      </w:r>
+    </w:p>
+    <w:p/>
+    <w:p/>
+    <w:p/>
+    <w:p>
+      <w:r>
+        <w:t>Multi-features ranking score</w:t>
+      </w:r>
+    </w:p>
+    <w:p/>
+    <w:p/>
+    <w:p>
+      <w:r>
+        <w:lastRenderedPageBreak/>
+        <w:drawing>
+          <wp:inline distT="0" distB="0" distL="0" distR="0" wp14:anchorId="17B69C7D" wp14:editId="79D45E1C">
+            <wp:extent cx="5760720" cy="2917825"/>
+            <wp:effectExtent l="0" t="0" r="5080" b="3175"/>
+            <wp:docPr id="1484939785" name="Grafik 1"/>
+            <wp:cNvGraphicFramePr>
+              <a:graphicFrameLocks xmlns:a="http://schemas.openxmlformats.org/drawingml/2006/main" noChangeAspect="1"/>
+            </wp:cNvGraphicFramePr>
+            <a:graphic xmlns:a="http://schemas.openxmlformats.org/drawingml/2006/main">
+              <a:graphicData uri="http://schemas.openxmlformats.org/drawingml/2006/picture">
+                <pic:pic xmlns:pic="http://schemas.openxmlformats.org/drawingml/2006/picture">
+                  <pic:nvPicPr>
+                    <pic:cNvPr id="1484939785" name=""/>
+                    <pic:cNvPicPr/>
+                  </pic:nvPicPr>
+                  <pic:blipFill>
+                    <a:blip r:embed="rId9"/>
+                    <a:stretch>
+                      <a:fillRect/>
+                    </a:stretch>
+                  </pic:blipFill>
+                  <pic:spPr>
+                    <a:xfrm>
+                      <a:off x="0" y="0"/>
+                      <a:ext cx="5760720" cy="2917825"/>
+                    </a:xfrm>
+                    <a:prstGeom prst="rect">
+                      <a:avLst/>
+                    </a:prstGeom>
+                  </pic:spPr>
+                </pic:pic>
+              </a:graphicData>
+            </a:graphic>
+          </wp:inline>
+        </w:drawing>
+      </w:r>
+    </w:p>
     <w:p/>
     <w:p/>
     <w:p/>
@@ -2662,7 +2957,6 @@
     <w:next w:val="Standard"/>
     <w:link w:val="berschrift2Zchn"/>
     <w:uiPriority w:val="9"/>
-    <w:semiHidden/>
     <w:unhideWhenUsed/>
     <w:qFormat/>
     <w:rsid w:val="00B12AC4"/>
@@ -2835,7 +3129,6 @@
   <w:style w:type="character" w:default="1" w:styleId="Absatz-Standardschriftart">
     <w:name w:val="Default Paragraph Font"/>
     <w:uiPriority w:val="1"/>
-    <w:semiHidden/>
     <w:unhideWhenUsed/>
   </w:style>
   <w:style w:type="table" w:default="1" w:styleId="NormaleTabelle">
@@ -2878,7 +3171,6 @@
     <w:basedOn w:val="Absatz-Standardschriftart"/>
     <w:link w:val="berschrift2"/>
     <w:uiPriority w:val="9"/>
-    <w:semiHidden/>
     <w:rsid w:val="00B12AC4"/>
     <w:rPr>
       <w:rFonts w:asciiTheme="majorHAnsi" w:eastAsiaTheme="majorEastAsia" w:hAnsiTheme="majorHAnsi" w:cstheme="majorBidi"/>

</xml_diff>

<commit_message>
validation and updating all relevant figures
</commit_message>
<xml_diff>
--- a/01_Manuscript/draft/supplementary.docx
+++ b/01_Manuscript/draft/supplementary.docx
@@ -2266,6 +2266,9 @@
     <w:p/>
     <w:p>
       <w:r>
+        <w:rPr>
+          <w:noProof/>
+        </w:rPr>
         <w:drawing>
           <wp:inline distT="0" distB="0" distL="0" distR="0" wp14:anchorId="1DA3D1F4" wp14:editId="1EC3A082">
             <wp:extent cx="5760720" cy="2983230"/>
@@ -2307,6 +2310,59 @@
     <w:p/>
     <w:p>
       <w:r>
+        <w:rPr>
+          <w:i/>
+          <w:iCs/>
+          <w:noProof/>
+          <w:sz w:val="21"/>
+          <w:szCs w:val="21"/>
+        </w:rPr>
+        <w:drawing>
+          <wp:inline distT="0" distB="0" distL="0" distR="0" wp14:anchorId="3C6B9965" wp14:editId="01D48CA3">
+            <wp:extent cx="3792511" cy="2742380"/>
+            <wp:effectExtent l="0" t="0" r="5080" b="1270"/>
+            <wp:docPr id="687718624" name="Grafik 3" descr="Ein Bild, das Text, Screenshot, Reihe, Diagramm enthält.&#10;&#10;KI-generierte Inhalte können fehlerhaft sein."/>
+            <wp:cNvGraphicFramePr>
+              <a:graphicFrameLocks xmlns:a="http://schemas.openxmlformats.org/drawingml/2006/main" noChangeAspect="1"/>
+            </wp:cNvGraphicFramePr>
+            <a:graphic xmlns:a="http://schemas.openxmlformats.org/drawingml/2006/main">
+              <a:graphicData uri="http://schemas.openxmlformats.org/drawingml/2006/picture">
+                <pic:pic xmlns:pic="http://schemas.openxmlformats.org/drawingml/2006/picture">
+                  <pic:nvPicPr>
+                    <pic:cNvPr id="687718624" name="Grafik 3" descr="Ein Bild, das Text, Screenshot, Reihe, Diagramm enthält.&#10;&#10;KI-generierte Inhalte können fehlerhaft sein."/>
+                    <pic:cNvPicPr/>
+                  </pic:nvPicPr>
+                  <pic:blipFill>
+                    <a:blip r:embed="rId6" cstate="print">
+                      <a:extLst>
+                        <a:ext uri="{28A0092B-C50C-407E-A947-70E740481C1C}">
+                          <a14:useLocalDpi xmlns:a14="http://schemas.microsoft.com/office/drawing/2010/main" val="0"/>
+                        </a:ext>
+                      </a:extLst>
+                    </a:blip>
+                    <a:stretch>
+                      <a:fillRect/>
+                    </a:stretch>
+                  </pic:blipFill>
+                  <pic:spPr>
+                    <a:xfrm>
+                      <a:off x="0" y="0"/>
+                      <a:ext cx="3813415" cy="2757495"/>
+                    </a:xfrm>
+                    <a:prstGeom prst="rect">
+                      <a:avLst/>
+                    </a:prstGeom>
+                  </pic:spPr>
+                </pic:pic>
+              </a:graphicData>
+            </a:graphic>
+          </wp:inline>
+        </w:drawing>
+      </w:r>
+    </w:p>
+    <w:p/>
+    <w:p>
+      <w:r>
         <w:t>Bi-features vs multi-features assessment</w:t>
       </w:r>
     </w:p>
@@ -2315,6 +2371,10 @@
     <w:p/>
     <w:p>
       <w:r>
+        <w:rPr>
+          <w:noProof/>
+        </w:rPr>
+        <w:lastRenderedPageBreak/>
         <w:drawing>
           <wp:inline distT="0" distB="0" distL="0" distR="0" wp14:anchorId="1145DCC1" wp14:editId="7DD5DD79">
             <wp:extent cx="5760720" cy="3241675"/>
@@ -2331,7 +2391,7 @@
                     <pic:cNvPicPr/>
                   </pic:nvPicPr>
                   <pic:blipFill>
-                    <a:blip r:embed="rId6"/>
+                    <a:blip r:embed="rId7"/>
                     <a:stretch>
                       <a:fillRect/>
                     </a:stretch>
@@ -2358,7 +2418,6 @@
     <w:p/>
     <w:p>
       <w:r>
-        <w:lastRenderedPageBreak/>
         <w:t xml:space="preserve">Bi-features score validation </w:t>
       </w:r>
     </w:p>
@@ -2385,7 +2444,7 @@
                     <pic:cNvPicPr/>
                   </pic:nvPicPr>
                   <pic:blipFill>
-                    <a:blip r:embed="rId7" cstate="print">
+                    <a:blip r:embed="rId8" cstate="print">
                       <a:extLst>
                         <a:ext uri="{28A0092B-C50C-407E-A947-70E740481C1C}">
                           <a14:useLocalDpi xmlns:a14="http://schemas.microsoft.com/office/drawing/2010/main" val="0"/>
@@ -2417,6 +2476,7 @@
         <w:rPr>
           <w:noProof/>
         </w:rPr>
+        <w:lastRenderedPageBreak/>
         <w:drawing>
           <wp:inline distT="0" distB="0" distL="0" distR="0" wp14:anchorId="43E9BF45" wp14:editId="795B9A6C">
             <wp:extent cx="5069941" cy="4004203"/>
@@ -2447,7 +2507,7 @@
                     </pic:cNvPicPr>
                   </pic:nvPicPr>
                   <pic:blipFill>
-                    <a:blip r:embed="rId8"/>
+                    <a:blip r:embed="rId9"/>
                     <a:stretch>
                       <a:fillRect/>
                     </a:stretch>
@@ -2480,7 +2540,9 @@
     <w:p/>
     <w:p>
       <w:r>
-        <w:lastRenderedPageBreak/>
+        <w:rPr>
+          <w:noProof/>
+        </w:rPr>
         <w:drawing>
           <wp:inline distT="0" distB="0" distL="0" distR="0" wp14:anchorId="17B69C7D" wp14:editId="79D45E1C">
             <wp:extent cx="5760720" cy="2917825"/>
@@ -2497,7 +2559,7 @@
                     <pic:cNvPicPr/>
                   </pic:nvPicPr>
                   <pic:blipFill>
-                    <a:blip r:embed="rId9"/>
+                    <a:blip r:embed="rId10"/>
                     <a:stretch>
                       <a:fillRect/>
                     </a:stretch>
@@ -3129,6 +3191,7 @@
   <w:style w:type="character" w:default="1" w:styleId="Absatz-Standardschriftart">
     <w:name w:val="Default Paragraph Font"/>
     <w:uiPriority w:val="1"/>
+    <w:semiHidden/>
     <w:unhideWhenUsed/>
   </w:style>
   <w:style w:type="table" w:default="1" w:styleId="NormaleTabelle">

</xml_diff>